<commit_message>
Fixed PWA and service worker
</commit_message>
<xml_diff>
--- a/Project Documentation/Project Overview.docx
+++ b/Project Documentation/Project Overview.docx
@@ -71,7 +71,23 @@
           <w:b/>
           <w:sz w:val="28"/>
         </w:rPr>
-        <w:t xml:space="preserve">Development of ‘TasteTracker’ PWA </w:t>
+        <w:t>Development of ‘</w:t>
+      </w:r>
+      <w:proofErr w:type="spellStart"/>
+      <w:r>
+        <w:rPr>
+          <w:b/>
+          <w:sz w:val="28"/>
+        </w:rPr>
+        <w:t>TasteTracker</w:t>
+      </w:r>
+      <w:proofErr w:type="spellEnd"/>
+      <w:r>
+        <w:rPr>
+          <w:b/>
+          <w:sz w:val="28"/>
+        </w:rPr>
+        <w:t xml:space="preserve">’ PWA </w:t>
       </w:r>
     </w:p>
     <w:p>
@@ -210,7 +226,15 @@
         <w:ind w:hanging="360"/>
       </w:pPr>
       <w:r>
-        <w:t xml:space="preserve">After logging in/creating account user can add restaurant reviews that include: </w:t>
+        <w:t xml:space="preserve">After logging in/creating account user can add restaurant reviews that </w:t>
+      </w:r>
+      <w:proofErr w:type="gramStart"/>
+      <w:r>
+        <w:t>include:</w:t>
+      </w:r>
+      <w:proofErr w:type="gramEnd"/>
+      <w:r>
+        <w:t xml:space="preserve"> </w:t>
       </w:r>
       <w:r>
         <w:rPr>
@@ -415,7 +439,23 @@
         <w:ind w:right="496" w:hanging="360"/>
       </w:pPr>
       <w:r>
-        <w:t xml:space="preserve">Must maintain up to date project version on github using commits Must use secure coding practices i.e. password hashing, block XSS, Authorisation checks, ect. </w:t>
+        <w:t xml:space="preserve">Must maintain up to date project version on </w:t>
+      </w:r>
+      <w:proofErr w:type="spellStart"/>
+      <w:r>
+        <w:t>github</w:t>
+      </w:r>
+      <w:proofErr w:type="spellEnd"/>
+      <w:r>
+        <w:t xml:space="preserve"> using commits Must use secure coding practices i.e. password hashing, block XSS, Authorisation checks, </w:t>
+      </w:r>
+      <w:proofErr w:type="spellStart"/>
+      <w:r>
+        <w:t>ect</w:t>
+      </w:r>
+      <w:proofErr w:type="spellEnd"/>
+      <w:r>
+        <w:t xml:space="preserve">. </w:t>
       </w:r>
     </w:p>
     <w:p>
@@ -471,8 +511,13 @@
         </w:numPr>
         <w:ind w:hanging="360"/>
       </w:pPr>
-      <w:r>
-        <w:t xml:space="preserve">Github repository reflect agile workflow with a project board </w:t>
+      <w:proofErr w:type="spellStart"/>
+      <w:r>
+        <w:t>Github</w:t>
+      </w:r>
+      <w:proofErr w:type="spellEnd"/>
+      <w:r>
+        <w:t xml:space="preserve"> repository reflect agile workflow with a project board </w:t>
       </w:r>
     </w:p>
     <w:p>
@@ -584,7 +629,15 @@
         <w:ind w:left="10"/>
       </w:pPr>
       <w:r>
-        <w:t>The storyboard outlines the main pages of the TasteTracker PWA, what appears on each page, and how users navigate</w:t>
+        <w:t xml:space="preserve">The storyboard outlines the main pages of the </w:t>
+      </w:r>
+      <w:proofErr w:type="spellStart"/>
+      <w:r>
+        <w:t>TasteTracker</w:t>
+      </w:r>
+      <w:proofErr w:type="spellEnd"/>
+      <w:r>
+        <w:t xml:space="preserve"> PWA, what appears on each page, and how users navigate</w:t>
       </w:r>
     </w:p>
     <w:p>
@@ -626,10 +679,7 @@
         <w:t xml:space="preserve"> Welcome message</w:t>
       </w:r>
       <w:r>
-        <w:t>, site description</w:t>
-      </w:r>
-      <w:r>
-        <w:t xml:space="preserve"> and navbar</w:t>
+        <w:t xml:space="preserve"> and site description</w:t>
       </w:r>
     </w:p>
     <w:p>
@@ -641,14 +691,26 @@
         <w:t>Navigation:</w:t>
       </w:r>
       <w:r>
-        <w:t xml:space="preserve"> ‘Hamburger’ drop down menu</w:t>
-      </w:r>
-      <w:r>
-        <w:t xml:space="preserve">, where the user clicks on the title of the </w:t>
-      </w:r>
-      <w:r>
-        <w:t>page they want to navigate to and is then redirected</w:t>
-      </w:r>
+        <w:t xml:space="preserve"> </w:t>
+      </w:r>
+    </w:p>
+    <w:p>
+      <w:pPr>
+        <w:spacing w:after="174"/>
+        <w:ind w:left="10"/>
+      </w:pPr>
+      <w:r>
+        <w:t>Home &gt; Drop down menu</w:t>
+      </w:r>
+      <w:r>
+        <w:t xml:space="preserve"> &gt; Search, Login, Register or All Reviews page</w:t>
+      </w:r>
+    </w:p>
+    <w:p>
+      <w:pPr>
+        <w:spacing w:after="174"/>
+        <w:ind w:left="10"/>
+      </w:pPr>
     </w:p>
     <w:p>
       <w:pPr>
@@ -667,9 +729,6 @@
       <w:r>
         <w:t>Purpose: Allow new users to create an account</w:t>
       </w:r>
-      <w:r>
-        <w:t xml:space="preserve"> to access more features</w:t>
-      </w:r>
     </w:p>
     <w:p>
       <w:pPr>
@@ -683,10 +742,7 @@
         <w:t xml:space="preserve"> </w:t>
       </w:r>
       <w:r>
-        <w:t xml:space="preserve">Interactive form for account creation, </w:t>
-      </w:r>
-      <w:r>
-        <w:t>navbar</w:t>
+        <w:t>Interactive form for account creation</w:t>
       </w:r>
     </w:p>
     <w:p>
@@ -700,18 +756,51 @@
       <w:r>
         <w:t xml:space="preserve"> </w:t>
       </w:r>
-      <w:r>
-        <w:t>‘Hamburger’ drop down menu</w:t>
-      </w:r>
-      <w:r>
-        <w:t>, ‘Already have an account?’ hyperlink to login page</w:t>
-      </w:r>
-      <w:r>
-        <w:t xml:space="preserve">, submission of form </w:t>
-      </w:r>
-      <w:r>
-        <w:t>redirects to either login page or error page</w:t>
-      </w:r>
+    </w:p>
+    <w:p>
+      <w:pPr>
+        <w:spacing w:after="174"/>
+        <w:ind w:left="10"/>
+      </w:pPr>
+      <w:r>
+        <w:t xml:space="preserve">Register &gt; </w:t>
+      </w:r>
+      <w:r>
+        <w:t>Submit button</w:t>
+      </w:r>
+      <w:r>
+        <w:t xml:space="preserve"> &gt; Login page</w:t>
+      </w:r>
+    </w:p>
+    <w:p>
+      <w:pPr>
+        <w:spacing w:after="174"/>
+        <w:ind w:left="10"/>
+      </w:pPr>
+      <w:r>
+        <w:t>Register</w:t>
+      </w:r>
+      <w:r>
+        <w:t xml:space="preserve"> &gt; ‘Already have an account?’ hyperlink &gt; Login page</w:t>
+      </w:r>
+    </w:p>
+    <w:p>
+      <w:pPr>
+        <w:spacing w:after="174"/>
+        <w:ind w:left="10"/>
+      </w:pPr>
+      <w:r>
+        <w:t xml:space="preserve">Register &gt; Drop Down menu &gt; </w:t>
+      </w:r>
+      <w:r>
+        <w:t>Search, Login, Register or All Reviews page</w:t>
+      </w:r>
+    </w:p>
+    <w:p>
+      <w:pPr>
+        <w:spacing w:after="174"/>
+        <w:ind w:left="10"/>
+      </w:pPr>
     </w:p>
     <w:p>
       <w:pPr>
@@ -749,7 +838,7 @@
         <w:t>Features:</w:t>
       </w:r>
       <w:r>
-        <w:t xml:space="preserve"> Interactive form for account login, navbar</w:t>
+        <w:t xml:space="preserve"> Interactive form for account login</w:t>
       </w:r>
     </w:p>
     <w:p>
@@ -769,6 +858,43 @@
         <w:spacing w:after="174"/>
         <w:ind w:left="10"/>
       </w:pPr>
+      <w:r>
+        <w:t xml:space="preserve">Login &gt; Login Button &gt; </w:t>
+      </w:r>
+      <w:r>
+        <w:t>User Dashboard</w:t>
+      </w:r>
+    </w:p>
+    <w:p>
+      <w:pPr>
+        <w:spacing w:after="174"/>
+        <w:ind w:left="10"/>
+      </w:pPr>
+      <w:r>
+        <w:t xml:space="preserve">Login &gt; Drop Down Menu &gt; </w:t>
+      </w:r>
+      <w:r>
+        <w:t>Search, Login, Register or All Reviews page</w:t>
+      </w:r>
+    </w:p>
+    <w:p>
+      <w:pPr>
+        <w:spacing w:after="174"/>
+        <w:ind w:left="10"/>
+      </w:pPr>
+      <w:r>
+        <w:lastRenderedPageBreak/>
+        <w:t>Login &gt; Invalid login &gt; Login</w:t>
+      </w:r>
+      <w:r>
+        <w:t xml:space="preserve"> and error message</w:t>
+      </w:r>
+    </w:p>
+    <w:p>
+      <w:pPr>
+        <w:spacing w:after="174"/>
+        <w:ind w:left="10"/>
+      </w:pPr>
     </w:p>
     <w:p>
       <w:pPr>
@@ -787,6 +913,9 @@
       <w:r>
         <w:t>Purpose:</w:t>
       </w:r>
+      <w:r>
+        <w:t xml:space="preserve"> Main page for logged in users</w:t>
+      </w:r>
     </w:p>
     <w:p>
       <w:pPr>
@@ -796,12 +925,15 @@
       <w:r>
         <w:t>Features:</w:t>
       </w:r>
-    </w:p>
-    <w:p>
-      <w:pPr>
-        <w:spacing w:after="174"/>
-        <w:ind w:left="10"/>
-      </w:pPr>
+      <w:r>
+        <w:t xml:space="preserve"> </w:t>
+      </w:r>
+      <w:r>
+        <w:t>Welcome message with username, member pages</w:t>
+      </w:r>
+      <w:r>
+        <w:t xml:space="preserve"> access</w:t>
+      </w:r>
     </w:p>
     <w:p>
       <w:pPr>
@@ -818,34 +950,272 @@
         <w:ind w:left="10"/>
       </w:pPr>
       <w:r>
+        <w:t xml:space="preserve">Dashboard &gt; Drop Down Menu &gt; Add Review, My </w:t>
+      </w:r>
+      <w:r>
+        <w:t>R</w:t>
+      </w:r>
+      <w:r>
+        <w:t>evi</w:t>
+      </w:r>
+      <w:r>
+        <w:t>ews, Search Reviews</w:t>
+      </w:r>
+    </w:p>
+    <w:p>
+      <w:pPr>
+        <w:spacing w:after="174"/>
+        <w:ind w:left="10"/>
+      </w:pPr>
+      <w:r>
+        <w:t>Dashboard &gt; Drop Down Menu &gt;</w:t>
+      </w:r>
+      <w:r>
+        <w:t xml:space="preserve"> Logout</w:t>
+      </w:r>
+      <w:r>
+        <w:t xml:space="preserve"> &gt; Homepage</w:t>
+      </w:r>
+    </w:p>
+    <w:p>
+      <w:pPr>
+        <w:spacing w:after="174"/>
+        <w:ind w:left="10"/>
+      </w:pPr>
+      <w:r>
+        <w:t>5. Add Review Page</w:t>
+      </w:r>
+    </w:p>
+    <w:p>
+      <w:pPr>
+        <w:spacing w:after="174"/>
+        <w:ind w:left="10"/>
+      </w:pPr>
+      <w:r>
+        <w:t>Purpose: Allow logged-in users to submit reviews.</w:t>
+      </w:r>
+    </w:p>
+    <w:p>
+      <w:pPr>
+        <w:spacing w:after="174"/>
+        <w:ind w:left="10"/>
+      </w:pPr>
+      <w:r>
+        <w:t>Features:</w:t>
+      </w:r>
+      <w:r>
+        <w:t xml:space="preserve"> Review submission form</w:t>
+      </w:r>
+      <w:r>
+        <w:t>, Rating system with interactive stars</w:t>
+      </w:r>
+    </w:p>
+    <w:p>
+      <w:pPr>
+        <w:spacing w:after="174"/>
+        <w:ind w:left="10"/>
+      </w:pPr>
+      <w:r>
+        <w:t>Navigation:</w:t>
+      </w:r>
+    </w:p>
+    <w:p>
+      <w:pPr>
+        <w:spacing w:after="174"/>
+        <w:ind w:left="10"/>
+      </w:pPr>
+      <w:r>
+        <w:t>Add Review &gt; Subm</w:t>
+      </w:r>
+      <w:r>
+        <w:t>it button &gt; My Reviews</w:t>
+      </w:r>
+    </w:p>
+    <w:p>
+      <w:pPr>
+        <w:spacing w:after="174"/>
+        <w:ind w:left="10"/>
+      </w:pPr>
+      <w:r>
+        <w:t>Add Review</w:t>
+      </w:r>
+      <w:r>
+        <w:t xml:space="preserve"> &gt; Drop Down Menu &gt; </w:t>
+      </w:r>
+      <w:r>
+        <w:t xml:space="preserve">Dashboard, </w:t>
+      </w:r>
+      <w:r>
+        <w:t>Add Review, My Reviews, Search Reviews</w:t>
+      </w:r>
+    </w:p>
+    <w:p>
+      <w:pPr>
+        <w:spacing w:after="174"/>
+        <w:ind w:left="10"/>
+      </w:pPr>
+      <w:r>
+        <w:t>Add Review</w:t>
+      </w:r>
+      <w:r>
+        <w:t xml:space="preserve"> &gt; Drop Down Menu &gt; Logout &gt; Homepage</w:t>
+      </w:r>
+    </w:p>
+    <w:p>
+      <w:pPr>
+        <w:spacing w:after="174"/>
+        <w:ind w:left="10"/>
+      </w:pPr>
+    </w:p>
+    <w:p>
+      <w:pPr>
+        <w:spacing w:after="174"/>
+        <w:ind w:left="10"/>
+      </w:pPr>
+      <w:r>
+        <w:t>My Reviews Page</w:t>
+      </w:r>
+    </w:p>
+    <w:p>
+      <w:pPr>
+        <w:spacing w:after="174"/>
+        <w:ind w:left="10"/>
+      </w:pPr>
+      <w:r>
+        <w:t xml:space="preserve">Purpose: Displays only that users </w:t>
+      </w:r>
+      <w:proofErr w:type="gramStart"/>
+      <w:r>
+        <w:t>reviews</w:t>
+      </w:r>
+      <w:proofErr w:type="gramEnd"/>
+      <w:r>
+        <w:t xml:space="preserve"> and allows editing/deleting</w:t>
+      </w:r>
+    </w:p>
+    <w:p>
+      <w:pPr>
+        <w:spacing w:after="174"/>
+        <w:ind w:left="10"/>
+      </w:pPr>
+      <w:r>
+        <w:t>Features</w:t>
+      </w:r>
+      <w:r>
+        <w:t>: Display of all user reviews, edit and delete buttons for each review</w:t>
+      </w:r>
+    </w:p>
+    <w:p>
+      <w:pPr>
+        <w:spacing w:after="174"/>
+        <w:ind w:left="10"/>
+      </w:pPr>
+      <w:r>
+        <w:t>Navigation:</w:t>
+      </w:r>
+    </w:p>
+    <w:p>
+      <w:pPr>
+        <w:spacing w:after="174"/>
+        <w:ind w:left="10"/>
+      </w:pPr>
+      <w:r>
+        <w:t>My Reviews &gt; Edit Button &gt; Edit Page</w:t>
+      </w:r>
+    </w:p>
+    <w:p>
+      <w:pPr>
+        <w:spacing w:after="174"/>
+        <w:ind w:left="10"/>
+      </w:pPr>
+      <w:r>
+        <w:t>My Reviews &gt; Delete button &gt; My Reviews (Updated)</w:t>
+      </w:r>
+      <w:r>
+        <w:br/>
+      </w:r>
+      <w:r>
+        <w:t xml:space="preserve">My Reviews &gt; Drop Down Menu &gt; </w:t>
+      </w:r>
+      <w:r>
+        <w:t>Dashboard, Add Review, My Reviews, Search Reviews</w:t>
+      </w:r>
+    </w:p>
+    <w:p>
+      <w:pPr>
+        <w:spacing w:after="174"/>
+        <w:ind w:left="10"/>
+      </w:pPr>
+      <w:r>
+        <w:t xml:space="preserve">My Reviews </w:t>
+      </w:r>
+      <w:r>
+        <w:t>&gt; Drop Down Menu &gt; Logout &gt; Homepage</w:t>
+      </w:r>
+    </w:p>
+    <w:p>
+      <w:pPr>
+        <w:spacing w:after="174"/>
+        <w:ind w:left="10"/>
+      </w:pPr>
+    </w:p>
+    <w:p>
+      <w:pPr>
+        <w:spacing w:after="174"/>
+        <w:ind w:left="10"/>
+      </w:pPr>
+      <w:r>
+        <w:t>6. Edit Review Page</w:t>
+      </w:r>
+    </w:p>
+    <w:p>
+      <w:pPr>
+        <w:spacing w:after="174"/>
+        <w:ind w:left="10"/>
+      </w:pPr>
+      <w:r>
+        <w:t>Purpose:</w:t>
+      </w:r>
+      <w:r>
+        <w:t xml:space="preserve"> Allows user to edit</w:t>
+      </w:r>
+      <w:r>
+        <w:t xml:space="preserve"> their own</w:t>
+      </w:r>
+      <w:r>
+        <w:t xml:space="preserve"> existing reviews</w:t>
+      </w:r>
+    </w:p>
+    <w:p>
+      <w:pPr>
+        <w:spacing w:after="174"/>
+        <w:ind w:left="10"/>
+      </w:pPr>
+      <w:r>
+        <w:t>Features:</w:t>
+      </w:r>
+      <w:r>
+        <w:t xml:space="preserve"> Edit form, </w:t>
+      </w:r>
+      <w:proofErr w:type="gramStart"/>
+      <w:r>
+        <w:t>pre filled</w:t>
+      </w:r>
+      <w:proofErr w:type="gramEnd"/>
+      <w:r>
+        <w:t xml:space="preserve"> with original data</w:t>
+      </w:r>
+      <w:r>
+        <w:t>, save and delete options</w:t>
+      </w:r>
+    </w:p>
+    <w:p>
+      <w:pPr>
+        <w:spacing w:after="174"/>
+        <w:ind w:left="10"/>
+      </w:pPr>
+      <w:r>
         <w:lastRenderedPageBreak/>
-        <w:t>5. Add Review Page</w:t>
-      </w:r>
-    </w:p>
-    <w:p>
-      <w:pPr>
-        <w:spacing w:after="174"/>
-        <w:ind w:left="10"/>
-      </w:pPr>
-      <w:r>
-        <w:t>Purpose: Allow logged-in users to submit reviews.</w:t>
-      </w:r>
-    </w:p>
-    <w:p>
-      <w:pPr>
-        <w:spacing w:after="174"/>
-        <w:ind w:left="10"/>
-      </w:pPr>
-      <w:r>
-        <w:t>Features:</w:t>
-      </w:r>
-    </w:p>
-    <w:p>
-      <w:pPr>
-        <w:spacing w:after="174"/>
-        <w:ind w:left="10"/>
-      </w:pPr>
-      <w:r>
         <w:t>Navigation:</w:t>
       </w:r>
     </w:p>
@@ -855,34 +1225,43 @@
         <w:ind w:left="10"/>
       </w:pPr>
       <w:r>
-        <w:t>6. Edit Review Page</w:t>
-      </w:r>
-    </w:p>
-    <w:p>
-      <w:pPr>
-        <w:spacing w:after="174"/>
-        <w:ind w:left="10"/>
-      </w:pPr>
-      <w:r>
-        <w:t>Purpose:</w:t>
-      </w:r>
-    </w:p>
-    <w:p>
-      <w:pPr>
-        <w:spacing w:after="174"/>
-        <w:ind w:left="10"/>
-      </w:pPr>
-      <w:r>
-        <w:t>Features:</w:t>
-      </w:r>
-    </w:p>
-    <w:p>
-      <w:pPr>
-        <w:spacing w:after="174"/>
-        <w:ind w:left="10"/>
-      </w:pPr>
-      <w:r>
-        <w:t>Navigation:</w:t>
+        <w:t>Edit Review &gt; Save Changes Button &gt; My Reviews</w:t>
+      </w:r>
+    </w:p>
+    <w:p>
+      <w:pPr>
+        <w:spacing w:after="174"/>
+        <w:ind w:left="10"/>
+      </w:pPr>
+      <w:r>
+        <w:t>Edit Review &gt; Delete Button &gt; My Reviews</w:t>
+      </w:r>
+    </w:p>
+    <w:p>
+      <w:pPr>
+        <w:spacing w:after="174"/>
+        <w:ind w:left="10"/>
+      </w:pPr>
+      <w:r>
+        <w:t>Edit Review</w:t>
+      </w:r>
+      <w:r>
+        <w:t xml:space="preserve"> &gt; Drop Down Menu &gt; </w:t>
+      </w:r>
+      <w:r>
+        <w:t>Dashboard, Add Review, My Reviews, Search Reviews</w:t>
+      </w:r>
+    </w:p>
+    <w:p>
+      <w:pPr>
+        <w:spacing w:after="174"/>
+        <w:ind w:left="10"/>
+      </w:pPr>
+      <w:r>
+        <w:t xml:space="preserve">Edit Review </w:t>
+      </w:r>
+      <w:r>
+        <w:t>&gt; Drop Down Menu &gt; Logout &gt; Homepage</w:t>
       </w:r>
     </w:p>
     <w:p>
@@ -2235,6 +2614,7 @@
   <w:style w:type="paragraph" w:default="1" w:styleId="Normal">
     <w:name w:val="Normal"/>
     <w:qFormat/>
+    <w:rsid w:val="0080645B"/>
     <w:pPr>
       <w:spacing w:after="3" w:line="268" w:lineRule="auto"/>
       <w:ind w:left="3627" w:hanging="10"/>
@@ -2674,23 +3054,6 @@
 </file>
 
 <file path=customXml/item1.xml><?xml version="1.0" encoding="utf-8"?>
-<p:properties xmlns:p="http://schemas.microsoft.com/office/2006/metadata/properties" xmlns:xsi="http://www.w3.org/2001/XMLSchema-instance" xmlns:pc="http://schemas.microsoft.com/office/infopath/2007/PartnerControls">
-  <documentManagement>
-    <_activity xmlns="846dfc5c-9f7f-4e92-ad30-4a5e47816357" xsi:nil="true"/>
-  </documentManagement>
-</p:properties>
-</file>
-
-<file path=customXml/item2.xml><?xml version="1.0" encoding="utf-8"?>
-<?mso-contentType ?>
-<FormTemplates xmlns="http://schemas.microsoft.com/sharepoint/v3/contenttype/forms">
-  <Display>DocumentLibraryForm</Display>
-  <Edit>DocumentLibraryForm</Edit>
-  <New>DocumentLibraryForm</New>
-</FormTemplates>
-</file>
-
-<file path=customXml/item3.xml><?xml version="1.0" encoding="utf-8"?>
 <ct:contentTypeSchema xmlns:ct="http://schemas.microsoft.com/office/2006/metadata/contentType" xmlns:ma="http://schemas.microsoft.com/office/2006/metadata/properties/metaAttributes" ct:_="" ma:_="" ma:contentTypeName="Document" ma:contentTypeID="0x010100BA939F7BE111A944A4488D60D8AAF1FD" ma:contentTypeVersion="17" ma:contentTypeDescription="Create a new document." ma:contentTypeScope="" ma:versionID="67014462147d47d9670ceb65ed62ecd5">
   <xsd:schema xmlns:xsd="http://www.w3.org/2001/XMLSchema" xmlns:xs="http://www.w3.org/2001/XMLSchema" xmlns:p="http://schemas.microsoft.com/office/2006/metadata/properties" xmlns:ns3="846dfc5c-9f7f-4e92-ad30-4a5e47816357" xmlns:ns4="4b70f076-483f-4b25-af14-91e9590a952e" targetNamespace="http://schemas.microsoft.com/office/2006/metadata/properties" ma:root="true" ma:fieldsID="42613596f5e977241b6ae735079f6b32" ns3:_="" ns4:_="">
     <xsd:import namespace="846dfc5c-9f7f-4e92-ad30-4a5e47816357"/>
@@ -2937,25 +3300,24 @@
 </ct:contentTypeSchema>
 </file>
 
-<file path=customXml/itemProps1.xml><?xml version="1.0" encoding="utf-8"?>
-<ds:datastoreItem xmlns:ds="http://schemas.openxmlformats.org/officeDocument/2006/customXml" ds:itemID="{50BBC807-8F49-435B-91F4-0DD3958F7535}">
-  <ds:schemaRefs>
-    <ds:schemaRef ds:uri="http://schemas.microsoft.com/office/2006/metadata/properties"/>
-    <ds:schemaRef ds:uri="http://schemas.microsoft.com/office/infopath/2007/PartnerControls"/>
-    <ds:schemaRef ds:uri="846dfc5c-9f7f-4e92-ad30-4a5e47816357"/>
-  </ds:schemaRefs>
-</ds:datastoreItem>
+<file path=customXml/item2.xml><?xml version="1.0" encoding="utf-8"?>
+<?mso-contentType ?>
+<FormTemplates xmlns="http://schemas.microsoft.com/sharepoint/v3/contenttype/forms">
+  <Display>DocumentLibraryForm</Display>
+  <Edit>DocumentLibraryForm</Edit>
+  <New>DocumentLibraryForm</New>
+</FormTemplates>
 </file>
 
-<file path=customXml/itemProps2.xml><?xml version="1.0" encoding="utf-8"?>
-<ds:datastoreItem xmlns:ds="http://schemas.openxmlformats.org/officeDocument/2006/customXml" ds:itemID="{35AE87A1-6EEE-4392-8F57-B83236209E85}">
-  <ds:schemaRefs>
-    <ds:schemaRef ds:uri="http://schemas.microsoft.com/sharepoint/v3/contenttype/forms"/>
-  </ds:schemaRefs>
-</ds:datastoreItem>
+<file path=customXml/item3.xml><?xml version="1.0" encoding="utf-8"?>
+<p:properties xmlns:p="http://schemas.microsoft.com/office/2006/metadata/properties" xmlns:xsi="http://www.w3.org/2001/XMLSchema-instance" xmlns:pc="http://schemas.microsoft.com/office/infopath/2007/PartnerControls">
+  <documentManagement>
+    <_activity xmlns="846dfc5c-9f7f-4e92-ad30-4a5e47816357" xsi:nil="true"/>
+  </documentManagement>
+</p:properties>
 </file>
 
-<file path=customXml/itemProps3.xml><?xml version="1.0" encoding="utf-8"?>
+<file path=customXml/itemProps1.xml><?xml version="1.0" encoding="utf-8"?>
 <ds:datastoreItem xmlns:ds="http://schemas.openxmlformats.org/officeDocument/2006/customXml" ds:itemID="{2C0B7D2E-A583-4C33-B6B6-D82BD3051254}">
   <ds:schemaRefs>
     <ds:schemaRef ds:uri="http://schemas.microsoft.com/office/2006/metadata/contentType"/>
@@ -2972,4 +3334,22 @@
     <ds:schemaRef ds:uri="http://schemas.microsoft.com/internal/obd"/>
   </ds:schemaRefs>
 </ds:datastoreItem>
+</file>
+
+<file path=customXml/itemProps2.xml><?xml version="1.0" encoding="utf-8"?>
+<ds:datastoreItem xmlns:ds="http://schemas.openxmlformats.org/officeDocument/2006/customXml" ds:itemID="{35AE87A1-6EEE-4392-8F57-B83236209E85}">
+  <ds:schemaRefs>
+    <ds:schemaRef ds:uri="http://schemas.microsoft.com/sharepoint/v3/contenttype/forms"/>
+  </ds:schemaRefs>
+</ds:datastoreItem>
+</file>
+
+<file path=customXml/itemProps3.xml><?xml version="1.0" encoding="utf-8"?>
+<ds:datastoreItem xmlns:ds="http://schemas.openxmlformats.org/officeDocument/2006/customXml" ds:itemID="{50BBC807-8F49-435B-91F4-0DD3958F7535}">
+  <ds:schemaRefs>
+    <ds:schemaRef ds:uri="http://schemas.microsoft.com/office/2006/metadata/properties"/>
+    <ds:schemaRef ds:uri="http://schemas.microsoft.com/office/infopath/2007/PartnerControls"/>
+    <ds:schemaRef ds:uri="846dfc5c-9f7f-4e92-ad30-4a5e47816357"/>
+  </ds:schemaRefs>
+</ds:datastoreItem>
 </file>
</xml_diff>